<commit_message>
docs: standardize school name
</commit_message>
<xml_diff>
--- a/portfolio-assets/Bharath_Raj_P_Resume.docx
+++ b/portfolio-assets/Bharath_Raj_P_Resume.docx
@@ -616,7 +616,7 @@
           <w:color w:val="181D1C"/>
           <w:sz w:val="18"/>
         </w:rPr>
-        <w:t>HSC (Class XII) | 60% | R.C. Matric Hr. Sec. School, Natham</w:t>
+        <w:t>HSC (Class XII) | 60% | R.C. MATRIC HR. SEC. SCHOOL, NATHAM</w:t>
       </w:r>
     </w:p>
     <w:p>
@@ -628,7 +628,7 @@
           <w:color w:val="181D1C"/>
           <w:sz w:val="18"/>
         </w:rPr>
-        <w:t>SSLC (Class X) | 64% | R.C. Matric Hr. Sec. School, Natham</w:t>
+        <w:t>SSLC (Class X) | 64% | R.C. MATRIC HR. SEC. SCHOOL, NATHAM</w:t>
       </w:r>
     </w:p>
     <w:p>

</xml_diff>